<commit_message>
fix: add missing JD keywords (tokenization, guardrails, prompts/tools/reasoning)
</commit_message>
<xml_diff>
--- a/Mohamed_Shabeeth_N-AI_Customer_Engineer-Cognizant.docx
+++ b/Mohamed_Shabeeth_N-AI_Customer_Engineer-Cognizant.docx
@@ -152,7 +152,7 @@
           <w:rFonts w:ascii="Times New Roman" w:hAnsi="Times New Roman"/>
           <w:sz w:val="17"/>
         </w:rPr>
-        <w:t>Engineered an Agentic RAG system for health insurance using LangChain, vector databases, and LLM-powered agents with tool use and function calling for autonomous data retrieval and reasoning.</w:t>
+        <w:t>Engineered an Agentic RAG system for health insurance using LangChain, vector databases, and LLM-powered agents with tool use, function calling, and guardrails for autonomous data retrieval and reasoning.</w:t>
       </w:r>
     </w:p>
     <w:p>
@@ -181,6 +181,20 @@
           <w:sz w:val="17"/>
         </w:rPr>
         <w:t>Delivered Top 5/400+ at TCS AI Hackathon, building an LLM compliance tracker with automated SQL rule generation, RAG-based document retrieval, and human-in-the-loop approval workflow.</w:t>
+      </w:r>
+    </w:p>
+    <w:p>
+      <w:pPr>
+        <w:pStyle w:val="ListBullet"/>
+        <w:spacing w:after="30"/>
+        <w:ind w:left="288"/>
+      </w:pPr>
+      <w:r>
+        <w:rPr>
+          <w:rFonts w:ascii="Times New Roman" w:hAnsi="Times New Roman"/>
+          <w:sz w:val="17"/>
+        </w:rPr>
+        <w:t>Configured prompts, instructions, and reasoning strategies for AI agent development, defining tools and guardrails to ensure reliable and production-grade agent behavior.</w:t>
       </w:r>
     </w:p>
     <w:p>
@@ -287,7 +301,7 @@
           <w:rFonts w:ascii="Times New Roman" w:hAnsi="Times New Roman"/>
           <w:sz w:val="17"/>
         </w:rPr>
-        <w:t>Built document extraction pipeline combining Tesseract OCR and LLaVA, improving field-level extraction accuracy from 75% to 90%+ across 50+ document layouts using prompt engineering and model fine-tuning.</w:t>
+        <w:t>Built document extraction pipeline combining Tesseract OCR and LLaVA, improving field-level extraction accuracy from 75% to 90%+ across 50+ document layouts using prompt engineering, tokenization, and model fine-tuning.</w:t>
       </w:r>
     </w:p>
     <w:p>
@@ -676,7 +690,7 @@
           <w:rFonts w:ascii="Times New Roman" w:hAnsi="Times New Roman"/>
           <w:sz w:val="17"/>
         </w:rPr>
-        <w:t xml:space="preserve"> LangChain, LangGraph, RAG, LLMs, OpenAI API, Gemini API, Agentic AI, Prompt Engineering, Vector Search, ChromaDB, Human-in-the-Loop</w:t>
+        <w:t xml:space="preserve"> LangChain, LangGraph, RAG, LLMs, OpenAI API, Gemini API, Agentic AI, Prompt Engineering, Tokenization, Vector Search, ChromaDB, Guardrails, Human-in-the-Loop</w:t>
       </w:r>
     </w:p>
     <w:p>

</xml_diff>